<commit_message>
auto(daily): dev loop report 2026-06-23
</commit_message>
<xml_diff>
--- a/reports/hypothesis/2026-06-23.docx
+++ b/reports/hypothesis/2026-06-23.docx
@@ -15,7 +15,7 @@
         <w:rPr>
           <w:i/>
         </w:rPr>
-        <w:t>생성일: 2026-06-23 09:15 KST  |  표본: 측정소당 최소 2700건 / 총 13675건</w:t>
+        <w:t>생성일: 2026-06-23 13:19 KST  |  표본: 측정소당 최소 2705건 / 총 13700건</w:t>
       </w:r>
     </w:p>
     <w:p>
@@ -143,7 +143,7 @@
           </w:tcPr>
           <w:p>
             <w:r>
-              <w:t>35.339</w:t>
+              <w:t>35.307</w:t>
             </w:r>
           </w:p>
         </w:tc>
@@ -153,7 +153,7 @@
           </w:tcPr>
           <w:p>
             <w:r>
-              <w:t>32.512</w:t>
+              <w:t>32.472</w:t>
             </w:r>
           </w:p>
         </w:tc>
@@ -163,7 +163,7 @@
           </w:tcPr>
           <w:p>
             <w:r>
-              <w:t>+2.828</w:t>
+              <w:t>+2.835</w:t>
             </w:r>
           </w:p>
         </w:tc>
@@ -215,7 +215,7 @@
           </w:tcPr>
           <w:p>
             <w:r>
-              <w:t>19.932</w:t>
+              <w:t>19.915</w:t>
             </w:r>
           </w:p>
         </w:tc>
@@ -225,7 +225,7 @@
           </w:tcPr>
           <w:p>
             <w:r>
-              <w:t>17.268</w:t>
+              <w:t>17.252</w:t>
             </w:r>
           </w:p>
         </w:tc>
@@ -235,7 +235,7 @@
           </w:tcPr>
           <w:p>
             <w:r>
-              <w:t>+2.664</w:t>
+              <w:t>+2.662</w:t>
             </w:r>
           </w:p>
         </w:tc>
@@ -660,7 +660,7 @@
           </w:tcPr>
           <w:p>
             <w:r>
-              <w:t>30.79</w:t>
+              <w:t>30.99</w:t>
             </w:r>
           </w:p>
         </w:tc>
@@ -722,7 +722,7 @@
           </w:tcPr>
           <w:p>
             <w:r>
-              <w:t>82.66</w:t>
+              <w:t>83.09</w:t>
             </w:r>
           </w:p>
         </w:tc>
@@ -784,7 +784,7 @@
           </w:tcPr>
           <w:p>
             <w:r>
-              <w:t>14.77</w:t>
+              <w:t>14.83</w:t>
             </w:r>
           </w:p>
         </w:tc>
@@ -846,7 +846,7 @@
           </w:tcPr>
           <w:p>
             <w:r>
-              <w:t>162.36</w:t>
+              <w:t>161.97</w:t>
             </w:r>
           </w:p>
         </w:tc>
@@ -908,7 +908,7 @@
           </w:tcPr>
           <w:p>
             <w:r>
-              <w:t>70.68</w:t>
+              <w:t>70.73</w:t>
             </w:r>
           </w:p>
         </w:tc>
@@ -970,7 +970,7 @@
           </w:tcPr>
           <w:p>
             <w:r>
-              <w:t>175.29</w:t>
+              <w:t>174.38</w:t>
             </w:r>
           </w:p>
         </w:tc>

</xml_diff>